<commit_message>
docs(saturdays-ai): credit the full team on the DemoDay deliverables
Francisco Higuera (Docente de Programación), Cristian Guillermo (Docente
de Machine Learning) and José Francisco Silva (Director de la Carrera
Tecnología en Desarrollo de Software), all Unidad Académica Especializada
en la Formación Técnica y Tecnológica.
</commit_message>
<xml_diff>
--- a/docs/saturdays_ai/DemoDaySaturdaysAI_HybridRetrieval_Informe.docx
+++ b/docs/saturdays_ai/DemoDaySaturdaysAI_HybridRetrieval_Informe.docx
@@ -67,6 +67,78 @@
           <w:szCs w:val="24"/>
         </w:rPr>
         <w:t xml:space="preserve">Francisco Javier Higuera González</w:t>
+      </w:r>
+    </w:p>
+    <w:p>
+      <w:pPr>
+        <w:spacing w:before="20" w:after="160"/>
+        <w:jc w:val="center"/>
+      </w:pPr>
+      <w:r>
+        <w:rPr>
+          <w:color w:val="595959"/>
+          <w:sz w:val="20"/>
+          <w:szCs w:val="20"/>
+        </w:rPr>
+        <w:t xml:space="preserve">Docente de Programación · Unidad Académica Especializada en la Formación Técnica y Tecnológica</w:t>
+      </w:r>
+    </w:p>
+    <w:p>
+      <w:pPr>
+        <w:spacing w:before="0"/>
+        <w:jc w:val="center"/>
+      </w:pPr>
+      <w:r>
+        <w:rPr>
+          <w:b/>
+          <w:bCs/>
+          <w:sz w:val="24"/>
+          <w:szCs w:val="24"/>
+        </w:rPr>
+        <w:t xml:space="preserve">Cristian Guillermo</w:t>
+      </w:r>
+    </w:p>
+    <w:p>
+      <w:pPr>
+        <w:spacing w:before="20" w:after="160"/>
+        <w:jc w:val="center"/>
+      </w:pPr>
+      <w:r>
+        <w:rPr>
+          <w:color w:val="595959"/>
+          <w:sz w:val="20"/>
+          <w:szCs w:val="20"/>
+        </w:rPr>
+        <w:t xml:space="preserve">Docente de Machine Learning · Unidad Académica Especializada en la Formación Técnica y Tecnológica</w:t>
+      </w:r>
+    </w:p>
+    <w:p>
+      <w:pPr>
+        <w:spacing w:before="0"/>
+        <w:jc w:val="center"/>
+      </w:pPr>
+      <w:r>
+        <w:rPr>
+          <w:b/>
+          <w:bCs/>
+          <w:sz w:val="24"/>
+          <w:szCs w:val="24"/>
+        </w:rPr>
+        <w:t xml:space="preserve">José Francisco Silva</w:t>
+      </w:r>
+    </w:p>
+    <w:p>
+      <w:pPr>
+        <w:spacing w:before="20" w:after="160"/>
+        <w:jc w:val="center"/>
+      </w:pPr>
+      <w:r>
+        <w:rPr>
+          <w:color w:val="595959"/>
+          <w:sz w:val="20"/>
+          <w:szCs w:val="20"/>
+        </w:rPr>
+        <w:t xml:space="preserve">Director de la Carrera Tecnología en Desarrollo de Software · Unidad Académica Especializada en la Formación Técnica y Tecnológica</w:t>
       </w:r>
     </w:p>
     <w:p>
@@ -4902,7 +4974,7 @@
                 <w:sz w:val="20"/>
                 <w:szCs w:val="20"/>
               </w:rPr>
-              <w:t xml:space="preserve">Francisco Javier Higuera González · Universidad UTE</w:t>
+              <w:t xml:space="preserve">Francisco Javier Higuera González, Cristian Guillermo, José Francisco Silva · Universidad UTE</w:t>
             </w:r>
           </w:p>
         </w:tc>

</xml_diff>

<commit_message>
docs(saturdays-ai): fill in the real evaluation result (15/15 RAG vs 0/15 baseline)
Official POST /api/rag/evaluation/run against production (896 embeddings
reloaded with the E5 prefix fix, real vLLM + TEI), persisted in
rag_evaluation_runs and visible live on the Evaluación screen. Replaces
every "pendiente" placeholder in both the report and the deck with the
real figure, plus a qualitative example contrasting a hallucinated
baseline answer against the grounded RAG citation.
</commit_message>
<xml_diff>
--- a/docs/saturdays_ai/DemoDaySaturdaysAI_HybridRetrieval_Informe.docx
+++ b/docs/saturdays_ai/DemoDaySaturdaysAI_HybridRetrieval_Informe.docx
@@ -2865,11 +2865,11 @@
         <w:rPr>
           <w:b/>
           <w:bCs/>
-          <w:color w:val="B42318"/>
-          <w:sz w:val="22"/>
-          <w:szCs w:val="22"/>
-        </w:rPr>
-        <w:t xml:space="preserve">pendiente de la corrida final sobre embeddings calculados con el prefijo correcto (ver nota en la sección 7 — bug real encontrado y corregido, commit 862a8ae). </w:t>
+          <w:color w:val="028090"/>
+          <w:sz w:val="22"/>
+          <w:szCs w:val="22"/>
+        </w:rPr>
+        <w:t xml:space="preserve">15 de 15 preguntas (100%) citan el artículo correcto con RAG, contra 0 de 15 con el baseline. Corrida oficial persistida en producción el 11 de octubre de 2026, ya con los embeddings recargados (prefijo corregido, commit 862a8ae) y vLLM real respondiendo.</w:t>
       </w:r>
     </w:p>
     <w:p>
@@ -4051,11 +4051,11 @@
         <w:rPr>
           <w:b/>
           <w:bCs/>
-          <w:color w:val="B42318"/>
-          <w:sz w:val="22"/>
-          <w:szCs w:val="22"/>
-        </w:rPr>
-        <w:t xml:space="preserve">[PENDIENTE — corrida final tras recargar los embeddings de producción con el prefijo corregido]</w:t>
+          <w:color w:val="028090"/>
+          <w:sz w:val="22"/>
+          <w:szCs w:val="22"/>
+        </w:rPr>
+        <w:t xml:space="preserve">15 de 15 (100%), contra 0 de 15 del baseline</w:t>
       </w:r>
     </w:p>
     <w:p>
@@ -4067,7 +4067,7 @@
           <w:sz w:val="22"/>
           <w:szCs w:val="22"/>
         </w:rPr>
-        <w:t xml:space="preserve">Nota metodológica: la primera corrida completa (896/896 embeddings calculados) se hizo antes de aplicar la corrección de prefijos — sus resultados no son representativos y no se reportan aquí. Con los embeddings mock de desarrollo (pseudo-aleatorios por diseño), el resultado esperado y correcto es 0/15 en ambos casos, ya que no hay señal semántica real que recuperar — esto no es un error del sistema, es el comportamiento esperado de un adaptador mock, y es la razón por la que la demo usa cómputo real del HPC en vez de depender del modo mock.</w:t>
+        <w:t xml:space="preserve">Corrida oficial (POST /api/rag/evaluation/run) contra producción el 11 de octubre de 2026, con los 896 embeddings ya recargados con el prefijo corregido y vLLM/TEI reales respondiendo — persistida en rag_evaluation_runs, visible en vivo en la pantalla “Evaluación” de la plataforma. Ejemplo cualitativo (pregunta sobre el contenido obligatorio del sílabo): el baseline inventa un artículo equivocado (cita el “Artículo 35” y una universidad que no existe, “Universidad Tecnológica de El Salvador”) con una respuesta que suena correcta pero no lo es; el RAG cita el artículo real (Artículo 67 del Reglamento de Régimen Académico) con el texto exacto de la normativa. Con los embeddings mock de desarrollo (pseudo-aleatorios por diseño) el resultado esperado y correcto sigue siendo 0/15 en ambos casos — no es un error del sistema, es el comportamiento esperado de un adaptador mock.</w:t>
       </w:r>
     </w:p>
     <w:p>
@@ -4519,7 +4519,7 @@
           <w:sz w:val="22"/>
           <w:szCs w:val="22"/>
         </w:rPr>
-        <w:t xml:space="preserve">La cifra cuantitativa de aciertos RAG vs. baseline sobre producción real está pendiente de la corrida final posterior a la recarga de embeddings corregidos (ver sección 7).</w:t>
+        <w:t xml:space="preserve">El checklist aún no se ha validado con retroalimentación de coordinadores de carrera reales sobre una muestra amplia de sílabos — la corrida de 15/15 (sección 7) mide la recuperación, no el acuerdo humano-IA sobre el veredicto final.</w:t>
       </w:r>
     </w:p>
     <w:p>

</xml_diff>

<commit_message>
docs(saturdays-ai): reflect 14B/2-GPU HPC architecture in deliverables, add demo questions
Updates the informe and presentacion with the AI Tutor's HPC connection,
the 14B text model upgrade, and the new chat de normativa screen — all
previously only in the plan log. Adds a step-by-step RAG mechanism
explanation to the informe, and a new doc with example demo questions
tested live in production.
</commit_message>
<xml_diff>
--- a/docs/saturdays_ai/DemoDaySaturdaysAI_HybridRetrieval_Informe.docx
+++ b/docs/saturdays_ai/DemoDaySaturdaysAI_HybridRetrieval_Informe.docx
@@ -1194,7 +1194,7 @@
           <w:sz w:val="22"/>
           <w:szCs w:val="22"/>
         </w:rPr>
-        <w:t xml:space="preserve">Qwen/Qwen2.5-7B-Instruct</w:t>
+        <w:t xml:space="preserve">Qwen/Qwen2.5-14B-Instruct</w:t>
       </w:r>
       <w:r>
         <w:rPr>
@@ -1330,6 +1330,200 @@
           <w:szCs w:val="22"/>
         </w:rPr>
         <w:t xml:space="preserve">El índice BM25 se construye una sola vez por petición (no una vez por cada uno de los 5 criterios o las 15 preguntas de evaluación) para no repetir ese cálculo innecesariamente en el servidor de producción.</w:t>
+      </w:r>
+    </w:p>
+    <w:p>
+      <w:pPr>
+        <w:pStyle w:val="Heading2"/>
+        <w:spacing w:after="120" w:before="280"/>
+      </w:pPr>
+      <w:r>
+        <w:rPr>
+          <w:b/>
+          <w:bCs/>
+          <w:color w:val="2F3C7E"/>
+        </w:rPr>
+        <w:t xml:space="preserve">Mecanismo paso a paso (lo que pasa en cada consulta)</w:t>
+      </w:r>
+    </w:p>
+    <w:p>
+      <w:pPr>
+        <w:spacing w:after="160"/>
+      </w:pPr>
+      <w:r>
+        <w:rPr>
+          <w:sz w:val="22"/>
+          <w:szCs w:val="22"/>
+        </w:rPr>
+        <w:t xml:space="preserve">Importante: ni TEI ni LanceDB "buscan" nada por sí mismos — TEI solo convierte texto en vectores; LanceDB solo guarda y entrega los vectores ya calculados. La búsqueda (coseno + BM25 + fusión) es código Python normal, corriendo en el VPS, no dentro de ningún modelo ni base de datos.</w:t>
+      </w:r>
+    </w:p>
+    <w:p>
+      <w:pPr>
+        <w:spacing w:after="100"/>
+      </w:pPr>
+      <w:r>
+        <w:rPr>
+          <w:b/>
+          <w:bCs/>
+          <w:sz w:val="22"/>
+          <w:szCs w:val="22"/>
+        </w:rPr>
+        <w:t xml:space="preserve">1. La pregunta llega al backend </w:t>
+      </w:r>
+      <w:r>
+        <w:rPr>
+          <w:sz w:val="22"/>
+          <w:szCs w:val="22"/>
+        </w:rPr>
+        <w:t xml:space="preserve">(FastAPI, en el VPS).</w:t>
+      </w:r>
+    </w:p>
+    <w:p>
+      <w:pPr>
+        <w:spacing w:after="100"/>
+      </w:pPr>
+      <w:r>
+        <w:rPr>
+          <w:b/>
+          <w:bCs/>
+          <w:sz w:val="22"/>
+          <w:szCs w:val="22"/>
+        </w:rPr>
+        <w:t xml:space="preserve">2. El backend manda la pregunta a TEI </w:t>
+      </w:r>
+      <w:r>
+        <w:rPr>
+          <w:sz w:val="22"/>
+          <w:szCs w:val="22"/>
+        </w:rPr>
+        <w:t xml:space="preserve">(una sola llamada HTTP, con el prefijo "query: ") y recibe su vector — es la única vez que se usa un modelo para esto.</w:t>
+      </w:r>
+    </w:p>
+    <w:p>
+      <w:pPr>
+        <w:spacing w:after="100"/>
+      </w:pPr>
+      <w:r>
+        <w:rPr>
+          <w:b/>
+          <w:bCs/>
+          <w:sz w:val="22"/>
+          <w:szCs w:val="22"/>
+        </w:rPr>
+        <w:t xml:space="preserve">3. El backend carga los 896 fragmentos desde LanceDB </w:t>
+      </w:r>
+      <w:r>
+        <w:rPr>
+          <w:sz w:val="22"/>
+          <w:szCs w:val="22"/>
+        </w:rPr>
+        <w:t xml:space="preserve">(list_all()) — trae todo a memoria; no es una búsqueda vectorial nativa de LanceDB, es traer los datos para compararlos en Python.</w:t>
+      </w:r>
+    </w:p>
+    <w:p>
+      <w:pPr>
+        <w:spacing w:after="100"/>
+      </w:pPr>
+      <w:r>
+        <w:rPr>
+          <w:b/>
+          <w:bCs/>
+          <w:sz w:val="22"/>
+          <w:szCs w:val="22"/>
+        </w:rPr>
+        <w:t xml:space="preserve">4. Dos rankings, calculados ahí mismo, sin GPU: </w:t>
+      </w:r>
+      <w:r>
+        <w:rPr>
+          <w:sz w:val="22"/>
+          <w:szCs w:val="22"/>
+        </w:rPr>
+        <w:t xml:space="preserve">similitud de coseno (vector de la pregunta contra los 896 guardados) y BM25 (texto de la pregunta contra el texto de los 896 fragmentos).</w:t>
+      </w:r>
+    </w:p>
+    <w:p>
+      <w:pPr>
+        <w:spacing w:after="100"/>
+      </w:pPr>
+      <w:r>
+        <w:rPr>
+          <w:b/>
+          <w:bCs/>
+          <w:sz w:val="22"/>
+          <w:szCs w:val="22"/>
+        </w:rPr>
+        <w:t xml:space="preserve">5. RRF fusiona ambos rankings </w:t>
+      </w:r>
+      <w:r>
+        <w:rPr>
+          <w:sz w:val="22"/>
+          <w:szCs w:val="22"/>
+        </w:rPr>
+        <w:t xml:space="preserve">y se queda con los 3 fragmentos mejor puntuados.</w:t>
+      </w:r>
+    </w:p>
+    <w:p>
+      <w:pPr>
+        <w:spacing w:after="100"/>
+      </w:pPr>
+      <w:r>
+        <w:rPr>
+          <w:b/>
+          <w:bCs/>
+          <w:sz w:val="22"/>
+          <w:szCs w:val="22"/>
+        </w:rPr>
+        <w:t xml:space="preserve">6. El backend arma un prompt </w:t>
+      </w:r>
+      <w:r>
+        <w:rPr>
+          <w:sz w:val="22"/>
+          <w:szCs w:val="22"/>
+        </w:rPr>
+        <w:t xml:space="preserve">con la pregunta + el texto de esos 3 fragmentos + instrucciones de sistema (citar el artículo, o avisar si no aplica).</w:t>
+      </w:r>
+    </w:p>
+    <w:p>
+      <w:pPr>
+        <w:spacing w:after="100"/>
+      </w:pPr>
+      <w:r>
+        <w:rPr>
+          <w:b/>
+          <w:bCs/>
+          <w:sz w:val="22"/>
+          <w:szCs w:val="22"/>
+        </w:rPr>
+        <w:t xml:space="preserve">7. Ese prompt se manda a vLLM </w:t>
+      </w:r>
+      <w:r>
+        <w:rPr>
+          <w:sz w:val="22"/>
+          <w:szCs w:val="22"/>
+        </w:rPr>
+        <w:t xml:space="preserve">(el modelo de generación, en el HPC, vía el túnel) — genera la respuesta en lenguaje natural.</w:t>
+      </w:r>
+    </w:p>
+    <w:p>
+      <w:pPr>
+        <w:spacing w:after="100"/>
+      </w:pPr>
+      <w:r>
+        <w:rPr>
+          <w:b/>
+          <w:bCs/>
+          <w:sz w:val="22"/>
+          <w:szCs w:val="22"/>
+        </w:rPr>
+        <w:t xml:space="preserve">8. El backend responde </w:t>
+      </w:r>
+      <w:r>
+        <w:rPr>
+          <w:sz w:val="22"/>
+          <w:szCs w:val="22"/>
+        </w:rPr>
+        <w:t xml:space="preserve">con el texto generado + las citas (documento y artículo) de los 3 fragmentos usados — son las que se muestran junto a la respuesta.</w:t>
       </w:r>
     </w:p>
     <w:p>
@@ -2215,7 +2409,7 @@
           <w:sz w:val="22"/>
           <w:szCs w:val="22"/>
         </w:rPr>
-        <w:t xml:space="preserve">Dos modelos pre-entrenados abiertos, cada uno detrás de su propio puerto, más una base de datos vectorial embebida y un índice de palabra clave, corriendo en el VPS (Virtual Private Server: servidor privado virtual) de producción — la pieza que no necesita GPU usa su CPU (unidad central de procesamiento) normal:</w:t>
+        <w:t xml:space="preserve">Tres modelos pre-entrenados abiertos, cada uno detrás de su propio puerto (el tercero, el del tutor, agregado el 11 de octubre en una segunda GPU), más una base de datos vectorial embebida y un índice de palabra clave, corriendo en el VPS (Virtual Private Server: servidor privado virtual) de producción — la pieza que no necesita GPU usa su CPU (unidad central de procesamiento) normal:</w:t>
       </w:r>
     </w:p>
     <w:tbl>
@@ -2428,7 +2622,7 @@
                 <w:sz w:val="20"/>
                 <w:szCs w:val="20"/>
               </w:rPr>
-              <w:t xml:space="preserve">Qwen/Qwen2.5-7B-Instruct</w:t>
+              <w:t xml:space="preserve">Qwen/Qwen2.5-14B-Instruct</w:t>
             </w:r>
           </w:p>
         </w:tc>
@@ -2598,6 +2792,77 @@
                 <w:szCs w:val="20"/>
               </w:rPr>
               <w:t xml:space="preserve">VPS de producción (co-localizado con la API)</w:t>
+            </w:r>
+          </w:p>
+        </w:tc>
+      </w:tr>
+      <w:tr>
+        <w:tc>
+          <w:tcPr>
+            <w:tcW w:type="dxa" w:w="2400"/>
+            <w:tcMar>
+              <w:top w:type="dxa" w:w="80"/>
+              <w:left w:type="dxa" w:w="100"/>
+              <w:bottom w:type="dxa" w:w="80"/>
+              <w:right w:type="dxa" w:w="100"/>
+            </w:tcMar>
+          </w:tcPr>
+          <w:p>
+            <w:r>
+              <w:rPr>
+                <w:b w:val="false"/>
+                <w:bCs w:val="false"/>
+                <w:color w:val="000000"/>
+                <w:sz w:val="20"/>
+                <w:szCs w:val="20"/>
+              </w:rPr>
+              <w:t xml:space="preserve">Tutor IA (texto + imagen)</w:t>
+            </w:r>
+          </w:p>
+        </w:tc>
+        <w:tc>
+          <w:tcPr>
+            <w:tcW w:type="dxa" w:w="4400"/>
+            <w:tcMar>
+              <w:top w:type="dxa" w:w="80"/>
+              <w:left w:type="dxa" w:w="100"/>
+              <w:bottom w:type="dxa" w:w="80"/>
+              <w:right w:type="dxa" w:w="100"/>
+            </w:tcMar>
+          </w:tcPr>
+          <w:p>
+            <w:r>
+              <w:rPr>
+                <w:b w:val="false"/>
+                <w:bCs w:val="false"/>
+                <w:color w:val="000000"/>
+                <w:sz w:val="20"/>
+                <w:szCs w:val="20"/>
+              </w:rPr>
+              <w:t xml:space="preserve">Qwen/Qwen2.5-VL-7B-Instruct</w:t>
+            </w:r>
+          </w:p>
+        </w:tc>
+        <w:tc>
+          <w:tcPr>
+            <w:tcW w:type="dxa" w:w="2550"/>
+            <w:tcMar>
+              <w:top w:type="dxa" w:w="80"/>
+              <w:left w:type="dxa" w:w="100"/>
+              <w:bottom w:type="dxa" w:w="80"/>
+              <w:right w:type="dxa" w:w="100"/>
+            </w:tcMar>
+          </w:tcPr>
+          <w:p>
+            <w:r>
+              <w:rPr>
+                <w:b w:val="false"/>
+                <w:bCs w:val="false"/>
+                <w:color w:val="000000"/>
+                <w:sz w:val="20"/>
+                <w:szCs w:val="20"/>
+              </w:rPr>
+              <w:t xml:space="preserve">HPC CEDIA — GPU dedicada (nuevo, 2026-10-11)</w:t>
             </w:r>
           </w:p>
         </w:tc>
@@ -2648,7 +2913,7 @@
           <w:sz w:val="22"/>
           <w:szCs w:val="22"/>
         </w:rPr>
-        <w:t xml:space="preserve">Qwen2.5-7B-Instruct: modelo abierto, cabe en una sola GPU A100 de 40GB, no requiere token de Hugging Face, y tiene buen desempeño en instrucciones en español.</w:t>
+        <w:t xml:space="preserve">Qwen2.5-14B-Instruct: modelo abierto, cabe en una sola GPU A100 de 40GB (29.6GB en bf16), no requiere token de Hugging Face, y tiene buen desempeño en instrucciones en español — se subió de 7B a 14B el 11 de octubre, re-evaluado con el mismo 15/15.</w:t>
       </w:r>
     </w:p>
     <w:p>
@@ -2970,86 +3235,6 @@
     </w:p>
     <w:p>
       <w:pPr>
-        <w:pStyle w:val="Heading2"/>
-        <w:spacing w:after="120" w:before="280"/>
-      </w:pPr>
-      <w:r>
-        <w:rPr>
-          <w:b/>
-          <w:bCs/>
-          <w:color w:val="2F3C7E"/>
-        </w:rPr>
-        <w:t xml:space="preserve">Caso de uso de principio a fin</w:t>
-      </w:r>
-    </w:p>
-    <w:p>
-      <w:pPr>
-        <w:spacing w:after="160"/>
-      </w:pPr>
-      <w:r>
-        <w:rPr>
-          <w:sz w:val="22"/>
-          <w:szCs w:val="22"/>
-        </w:rPr>
-        <w:t xml:space="preserve">Se presenta un sílabo real (uno de los que ya se imparten en la universidad) y se valida en segundos, mostrando al jurado tanto un criterio que cumple como uno que no cumple, con su cita respectiva — exactamente el caso de uso que un coordinador de carrera usaría hoy.</w:t>
-      </w:r>
-    </w:p>
-    <w:p>
-      <w:pPr>
-        <w:pStyle w:val="Heading1"/>
-        <w:spacing w:after="200" w:before="420"/>
-      </w:pPr>
-      <w:r>
-        <w:rPr>
-          <w:b/>
-          <w:bCs/>
-          <w:color w:val="1E2761"/>
-        </w:rPr>
-        <w:t xml:space="preserve">6. Deploy  ·  10% deploy / producto funcional</w:t>
-      </w:r>
-    </w:p>
-    <w:p>
-      <w:pPr>
-        <w:pStyle w:val="Heading2"/>
-        <w:spacing w:after="120" w:before="280"/>
-      </w:pPr>
-      <w:r>
-        <w:rPr>
-          <w:b/>
-          <w:bCs/>
-          <w:color w:val="2F3C7E"/>
-        </w:rPr>
-        <w:t xml:space="preserve">¿Dónde está desplegado?</w:t>
-      </w:r>
-    </w:p>
-    <w:p>
-      <w:pPr>
-        <w:spacing w:after="160"/>
-      </w:pPr>
-      <w:r>
-        <w:rPr>
-          <w:sz w:val="22"/>
-          <w:szCs w:val="22"/>
-        </w:rPr>
-        <w:t xml:space="preserve">En producción, en el mismo VPS donde corre el resto de la Vibe Coding Platform: backend FastAPI servido con gunicorn + systemd, frontend React servido como build estático por nginx, desplegados automáticamente en cada push a main vía GitHub Actions (rsync + SSH —Secure Shell, protocolo de conexión remota segura— con una llave de despliegue dedicada).</w:t>
-      </w:r>
-    </w:p>
-    <w:p>
-      <w:pPr>
-        <w:pStyle w:val="Heading2"/>
-        <w:spacing w:after="120" w:before="280"/>
-      </w:pPr>
-      <w:r>
-        <w:rPr>
-          <w:b/>
-          <w:bCs/>
-          <w:color w:val="2F3C7E"/>
-        </w:rPr>
-        <w:t xml:space="preserve">¿Cómo se consume?</w:t>
-      </w:r>
-    </w:p>
-    <w:p>
-      <w:pPr>
         <w:pStyle w:val="ListParagraph"/>
         <w:numPr>
           <w:ilvl w:val="0"/>
@@ -3059,10 +3244,99 @@
       </w:pPr>
       <w:r>
         <w:rPr>
-          <w:sz w:val="22"/>
-          <w:szCs w:val="22"/>
-        </w:rPr>
-        <w:t xml:space="preserve">API REST (Representational State Transfer, el estilo estándar de API web; FastAPI): endpoints /api/rag/validate-syllabus (texto), /api/rag/validate-syllabus/upload (.docx) y /api/rag/evaluation/run, protegidos por el mismo sistema de autenticación JWT (JSON Web Token, el formato estándar de token de sesión) y permisos RBAC (Role-Based Access Control: control de acceso basado en roles) del resto de la plataforma.</w:t>
+          <w:b/>
+          <w:bCs/>
+          <w:sz w:val="22"/>
+          <w:szCs w:val="22"/>
+        </w:rPr>
+        <w:t xml:space="preserve">Pantalla "Chat de normativa" (nueva): </w:t>
+      </w:r>
+      <w:r>
+        <w:rPr>
+          <w:sz w:val="22"/>
+          <w:szCs w:val="22"/>
+        </w:rPr>
+        <w:t xml:space="preserve">preguntas libres sobre normativa académica, mismo motor de recuperación híbrida — cita el artículo cuando la normativa lo cubre, o avisa explícitamente y responde con conocimiento general cuando no, sin presentar nunca ese conocimiento general como si fuera una cita oficial.</w:t>
+      </w:r>
+    </w:p>
+    <w:p>
+      <w:pPr>
+        <w:pStyle w:val="Heading2"/>
+        <w:spacing w:after="120" w:before="280"/>
+      </w:pPr>
+      <w:r>
+        <w:rPr>
+          <w:b/>
+          <w:bCs/>
+          <w:color w:val="2F3C7E"/>
+        </w:rPr>
+        <w:t xml:space="preserve">Caso de uso de principio a fin</w:t>
+      </w:r>
+    </w:p>
+    <w:p>
+      <w:pPr>
+        <w:spacing w:after="160"/>
+      </w:pPr>
+      <w:r>
+        <w:rPr>
+          <w:sz w:val="22"/>
+          <w:szCs w:val="22"/>
+        </w:rPr>
+        <w:t xml:space="preserve">Se presenta un sílabo real (uno de los que ya se imparten en la universidad) y se valida en segundos, mostrando al jurado tanto un criterio que cumple como uno que no cumple, con su cita respectiva — exactamente el caso de uso que un coordinador de carrera usaría hoy.</w:t>
+      </w:r>
+    </w:p>
+    <w:p>
+      <w:pPr>
+        <w:pStyle w:val="Heading1"/>
+        <w:spacing w:after="200" w:before="420"/>
+      </w:pPr>
+      <w:r>
+        <w:rPr>
+          <w:b/>
+          <w:bCs/>
+          <w:color w:val="1E2761"/>
+        </w:rPr>
+        <w:t xml:space="preserve">6. Deploy  ·  10% deploy / producto funcional</w:t>
+      </w:r>
+    </w:p>
+    <w:p>
+      <w:pPr>
+        <w:pStyle w:val="Heading2"/>
+        <w:spacing w:after="120" w:before="280"/>
+      </w:pPr>
+      <w:r>
+        <w:rPr>
+          <w:b/>
+          <w:bCs/>
+          <w:color w:val="2F3C7E"/>
+        </w:rPr>
+        <w:t xml:space="preserve">¿Dónde está desplegado?</w:t>
+      </w:r>
+    </w:p>
+    <w:p>
+      <w:pPr>
+        <w:spacing w:after="160"/>
+      </w:pPr>
+      <w:r>
+        <w:rPr>
+          <w:sz w:val="22"/>
+          <w:szCs w:val="22"/>
+        </w:rPr>
+        <w:t xml:space="preserve">En producción, en el mismo VPS donde corre el resto de la Vibe Coding Platform: backend FastAPI servido con gunicorn + systemd, frontend React servido como build estático por nginx, desplegados automáticamente en cada push a main vía GitHub Actions (rsync + SSH —Secure Shell, protocolo de conexión remota segura— con una llave de despliegue dedicada).</w:t>
+      </w:r>
+    </w:p>
+    <w:p>
+      <w:pPr>
+        <w:pStyle w:val="Heading2"/>
+        <w:spacing w:after="120" w:before="280"/>
+      </w:pPr>
+      <w:r>
+        <w:rPr>
+          <w:b/>
+          <w:bCs/>
+          <w:color w:val="2F3C7E"/>
+        </w:rPr>
+        <w:t xml:space="preserve">¿Cómo se consume?</w:t>
       </w:r>
     </w:p>
     <w:p>
@@ -3079,6 +3353,23 @@
           <w:sz w:val="22"/>
           <w:szCs w:val="22"/>
         </w:rPr>
+        <w:t xml:space="preserve">API REST (Representational State Transfer, el estilo estándar de API web; FastAPI): endpoints /api/rag/validate-syllabus (texto), /api/rag/validate-syllabus/upload (.docx) y /api/rag/evaluation/run, protegidos por el mismo sistema de autenticación JWT (JSON Web Token, el formato estándar de token de sesión) y permisos RBAC (Role-Based Access Control: control de acceso basado en roles) del resto de la plataforma.</w:t>
+      </w:r>
+    </w:p>
+    <w:p>
+      <w:pPr>
+        <w:pStyle w:val="ListParagraph"/>
+        <w:numPr>
+          <w:ilvl w:val="0"/>
+          <w:numId w:val="1"/>
+        </w:numPr>
+        <w:spacing w:after="80"/>
+      </w:pPr>
+      <w:r>
+        <w:rPr>
+          <w:sz w:val="22"/>
+          <w:szCs w:val="22"/>
+        </w:rPr>
         <w:t xml:space="preserve">Aplicación web: dos pantallas nuevas integradas en el menú de la plataforma existente (no un sitio aparte), con los mismos 4 idiomas (es/en/pt/fr) que el resto del producto.</w:t>
       </w:r>
     </w:p>
@@ -3105,7 +3396,7 @@
           <w:sz w:val="22"/>
           <w:szCs w:val="22"/>
         </w:rPr>
-        <w:t xml:space="preserve">El VPS aloja la API, el frontend, la base de datos vectorial (LanceDB) y el índice de palabra clave (BM25); el cómputo pesado (embeddings y generación) corre bajo demanda en el clúster HPC de CEDIA y se expone al VPS mediante dos túneles SSH inversos — el HPC no es alcanzable desde internet de forma directa, así que el propio nodo de cómputo abre la conexión hacia el VPS.</w:t>
+        <w:t xml:space="preserve">El VPS aloja la API, el frontend, la base de datos vectorial (LanceDB) y el índice de palabra clave (BM25); el cómputo pesado (embeddings, generación del RAG y generación/visión del tutor) corre bajo demanda en el clúster HPC de CEDIA, repartido en 2 GPUs, y se expone al VPS mediante 3 túneles SSH inversos — el HPC no es alcanzable desde internet de forma directa, así que el propio nodo de cómputo abre la conexión hacia el VPS.</w:t>
       </w:r>
     </w:p>
     <w:tbl>
@@ -3294,7 +3585,7 @@
                 <w:sz w:val="20"/>
                 <w:szCs w:val="20"/>
               </w:rPr>
-              <w:t xml:space="preserve">vLLM (Qwen2.5-7B-Instruct)</w:t>
+              <w:t xml:space="preserve">vLLM (Qwen2.5-14B-Instruct)</w:t>
             </w:r>
           </w:p>
         </w:tc>
@@ -3433,13 +3724,11 @@
           <w:p>
             <w:r>
               <w:rPr>
-                <w:b w:val="false"/>
-                <w:bCs w:val="false"/>
-                <w:color w:val="000000"/>
-                <w:sz w:val="20"/>
-                <w:szCs w:val="20"/>
-              </w:rPr>
-              <w:t xml:space="preserve">Túnel SSH inverso ×2</w:t>
+                <w:color w:val="000000"/>
+                <w:sz w:val="20"/>
+                <w:szCs w:val="20"/>
+              </w:rPr>
+              <w:t xml:space="preserve">vLLM (Qwen2.5-VL-7B-Instruct)</w:t>
             </w:r>
           </w:p>
         </w:tc>
@@ -3457,13 +3746,11 @@
           <w:p>
             <w:r>
               <w:rPr>
-                <w:b w:val="false"/>
-                <w:bCs w:val="false"/>
-                <w:color w:val="000000"/>
-                <w:sz w:val="20"/>
-                <w:szCs w:val="20"/>
-              </w:rPr>
-              <w:t xml:space="preserve">HPC → VPS</w:t>
+                <w:color w:val="000000"/>
+                <w:sz w:val="20"/>
+                <w:szCs w:val="20"/>
+              </w:rPr>
+              <w:t xml:space="preserve">HPC CEDIA · GPU A100 40GB dedicada</w:t>
             </w:r>
           </w:p>
         </w:tc>
@@ -3481,13 +3768,85 @@
           <w:p>
             <w:r>
               <w:rPr>
-                <w:b w:val="false"/>
-                <w:bCs w:val="false"/>
-                <w:color w:val="000000"/>
-                <w:sz w:val="20"/>
-                <w:szCs w:val="20"/>
-              </w:rPr>
-              <w:t xml:space="preserve">Expone vLLM y TEI al VPS sin IP pública en el HPC</w:t>
+                <w:color w:val="000000"/>
+                <w:sz w:val="20"/>
+                <w:szCs w:val="20"/>
+              </w:rPr>
+              <w:t xml:space="preserve">Genera las pistas del tutor y analiza imágenes (nuevo, 11 oct.)</w:t>
+            </w:r>
+          </w:p>
+        </w:tc>
+      </w:tr>
+      <w:tr>
+        <w:tc>
+          <w:tcPr>
+            <w:tcW w:type="dxa" w:w="3400"/>
+            <w:shd w:fill="EEF1F8" w:val="clear"/>
+            <w:tcMar>
+              <w:top w:type="dxa" w:w="80"/>
+              <w:left w:type="dxa" w:w="100"/>
+              <w:bottom w:type="dxa" w:w="80"/>
+              <w:right w:type="dxa" w:w="100"/>
+            </w:tcMar>
+          </w:tcPr>
+          <w:p>
+            <w:r>
+              <w:rPr>
+                <w:b w:val="false"/>
+                <w:bCs w:val="false"/>
+                <w:color w:val="000000"/>
+                <w:sz w:val="20"/>
+                <w:szCs w:val="20"/>
+              </w:rPr>
+              <w:t xml:space="preserve">Túnel SSH inverso ×3</w:t>
+            </w:r>
+          </w:p>
+        </w:tc>
+        <w:tc>
+          <w:tcPr>
+            <w:tcW w:type="dxa" w:w="3100"/>
+            <w:shd w:fill="EEF1F8" w:val="clear"/>
+            <w:tcMar>
+              <w:top w:type="dxa" w:w="80"/>
+              <w:left w:type="dxa" w:w="100"/>
+              <w:bottom w:type="dxa" w:w="80"/>
+              <w:right w:type="dxa" w:w="100"/>
+            </w:tcMar>
+          </w:tcPr>
+          <w:p>
+            <w:r>
+              <w:rPr>
+                <w:b w:val="false"/>
+                <w:bCs w:val="false"/>
+                <w:color w:val="000000"/>
+                <w:sz w:val="20"/>
+                <w:szCs w:val="20"/>
+              </w:rPr>
+              <w:t xml:space="preserve">HPC → VPS</w:t>
+            </w:r>
+          </w:p>
+        </w:tc>
+        <w:tc>
+          <w:tcPr>
+            <w:tcW w:type="dxa" w:w="2850"/>
+            <w:shd w:fill="EEF1F8" w:val="clear"/>
+            <w:tcMar>
+              <w:top w:type="dxa" w:w="80"/>
+              <w:left w:type="dxa" w:w="100"/>
+              <w:bottom w:type="dxa" w:w="80"/>
+              <w:right w:type="dxa" w:w="100"/>
+            </w:tcMar>
+          </w:tcPr>
+          <w:p>
+            <w:r>
+              <w:rPr>
+                <w:b w:val="false"/>
+                <w:bCs w:val="false"/>
+                <w:color w:val="000000"/>
+                <w:sz w:val="20"/>
+                <w:szCs w:val="20"/>
+              </w:rPr>
+              <w:t xml:space="preserve">Expone vLLM (RAG), TEI y vLLM-visión (tutor) al VPS sin IP pública en el HPC</w:t>
             </w:r>
           </w:p>
         </w:tc>

</xml_diff>